<commit_message>
chore: address PRD generator review feedback and expand resilience test cases
Agent-Logs-Url: https://github.com/Drakew0209/TravelApp/sessions/b8d7e328-200c-4d12-bdb1-193d7298caef

Co-authored-by: Drakew0209 <150531048+Drakew0209@users.noreply.github.com>
</commit_message>
<xml_diff>
--- a/docs/TravelApp-PRD-BaoCao.docx
+++ b/docs/TravelApp-PRD-BaoCao.docx
@@ -3756,6 +3756,130 @@
           </w:tcPr>
           <w:p>
             <w:r>
+              <w:t xml:space="preserve">TC-MOB-10</w:t>
+            </w:r>
+          </w:p>
+        </w:tc>
+        <w:tc>
+          <w:tcPr>
+            <w:tcW w:w="2000" w:type="dxa"/>
+          </w:tcPr>
+          <w:p>
+            <w:r>
+              <w:t xml:space="preserve">Mobile</w:t>
+            </w:r>
+          </w:p>
+        </w:tc>
+        <w:tc>
+          <w:tcPr>
+            <w:tcW w:w="2000" w:type="dxa"/>
+          </w:tcPr>
+          <w:p>
+            <w:r>
+              <w:t xml:space="preserve">Trung bình</w:t>
+            </w:r>
+          </w:p>
+        </w:tc>
+        <w:tc>
+          <w:tcPr>
+            <w:tcW w:w="2000" w:type="dxa"/>
+          </w:tcPr>
+          <w:p>
+            <w:r>
+              <w:t xml:space="preserve">Offline-first + API lỗi 5xx</w:t>
+            </w:r>
+          </w:p>
+        </w:tc>
+        <w:tc>
+          <w:tcPr>
+            <w:tcW w:w="2000" w:type="dxa"/>
+          </w:tcPr>
+          <w:p>
+            <w:r>
+              <w:t xml:space="preserve">Kích hoạt sync nền khi API lỗi</w:t>
+            </w:r>
+          </w:p>
+        </w:tc>
+        <w:tc>
+          <w:tcPr>
+            <w:tcW w:w="2000" w:type="dxa"/>
+          </w:tcPr>
+          <w:p>
+            <w:r>
+              <w:t xml:space="preserve">Ứng dụng giữ dữ liệu cache, không crash, ghi log lỗi</w:t>
+            </w:r>
+          </w:p>
+        </w:tc>
+      </w:tr>
+      <w:tr>
+        <w:tc>
+          <w:tcPr>
+            <w:tcW w:w="2000" w:type="dxa"/>
+          </w:tcPr>
+          <w:p>
+            <w:r>
+              <w:t xml:space="preserve">TC-MOB-11</w:t>
+            </w:r>
+          </w:p>
+        </w:tc>
+        <w:tc>
+          <w:tcPr>
+            <w:tcW w:w="2000" w:type="dxa"/>
+          </w:tcPr>
+          <w:p>
+            <w:r>
+              <w:t xml:space="preserve">Mobile</w:t>
+            </w:r>
+          </w:p>
+        </w:tc>
+        <w:tc>
+          <w:tcPr>
+            <w:tcW w:w="2000" w:type="dxa"/>
+          </w:tcPr>
+          <w:p>
+            <w:r>
+              <w:t xml:space="preserve">Trung bình</w:t>
+            </w:r>
+          </w:p>
+        </w:tc>
+        <w:tc>
+          <w:tcPr>
+            <w:tcW w:w="2000" w:type="dxa"/>
+          </w:tcPr>
+          <w:p>
+            <w:r>
+              <w:t xml:space="preserve">Offline-first + timeout mạng</w:t>
+            </w:r>
+          </w:p>
+        </w:tc>
+        <w:tc>
+          <w:tcPr>
+            <w:tcW w:w="2000" w:type="dxa"/>
+          </w:tcPr>
+          <w:p>
+            <w:r>
+              <w:t xml:space="preserve">Trigger đồng bộ với timeout ngắn</w:t>
+            </w:r>
+          </w:p>
+        </w:tc>
+        <w:tc>
+          <w:tcPr>
+            <w:tcW w:w="2000" w:type="dxa"/>
+          </w:tcPr>
+          <w:p>
+            <w:r>
+              <w:t xml:space="preserve">Sync fail graceful, thử lại ở lần sync kế tiếp</w:t>
+            </w:r>
+          </w:p>
+        </w:tc>
+      </w:tr>
+      <w:tr>
+        <w:tc>
+          <w:tcPr>
+            <w:tcW w:w="2000" w:type="dxa"/>
+          </w:tcPr>
+          <w:p>
+            <w:r>
               <w:t xml:space="preserve">TC-ADMWEB-01</w:t>
             </w:r>
           </w:p>
@@ -4303,6 +4427,68 @@
           <w:p>
             <w:r>
               <w:t xml:space="preserve">Không còn callback phát audio sau khi stop</w:t>
+            </w:r>
+          </w:p>
+        </w:tc>
+      </w:tr>
+      <w:tr>
+        <w:tc>
+          <w:tcPr>
+            <w:tcW w:w="2000" w:type="dxa"/>
+          </w:tcPr>
+          <w:p>
+            <w:r>
+              <w:t xml:space="preserve">TC-RUN-03</w:t>
+            </w:r>
+          </w:p>
+        </w:tc>
+        <w:tc>
+          <w:tcPr>
+            <w:tcW w:w="2000" w:type="dxa"/>
+          </w:tcPr>
+          <w:p>
+            <w:r>
+              <w:t xml:space="preserve">Runtime Service</w:t>
+            </w:r>
+          </w:p>
+        </w:tc>
+        <w:tc>
+          <w:tcPr>
+            <w:tcW w:w="2000" w:type="dxa"/>
+          </w:tcPr>
+          <w:p>
+            <w:r>
+              <w:t xml:space="preserve">Trung bình</w:t>
+            </w:r>
+          </w:p>
+        </w:tc>
+        <w:tc>
+          <w:tcPr>
+            <w:tcW w:w="2000" w:type="dxa"/>
+          </w:tcPr>
+          <w:p>
+            <w:r>
+              <w:t xml:space="preserve">Giả lập GPS cập nhật tần suất cao</w:t>
+            </w:r>
+          </w:p>
+        </w:tc>
+        <w:tc>
+          <w:tcPr>
+            <w:tcW w:w="2000" w:type="dxa"/>
+          </w:tcPr>
+          <w:p>
+            <w:r>
+              <w:t xml:space="preserve">Bắn 50-100 location events/phút</w:t>
+            </w:r>
+          </w:p>
+        </w:tc>
+        <w:tc>
+          <w:tcPr>
+            <w:tcW w:w="2000" w:type="dxa"/>
+          </w:tcPr>
+          <w:p>
+            <w:r>
+              <w:t xml:space="preserve">Không tràn hàng đợi xử lý; app vẫn phản hồi</w:t>
             </w:r>
           </w:p>
         </w:tc>

</xml_diff>